<commit_message>
Website finished for now?
</commit_message>
<xml_diff>
--- a/site/public/Resume.docx
+++ b/site/public/Resume.docx
@@ -169,7 +169,13 @@
               <w:rPr>
                 <w:color w:val="auto"/>
               </w:rPr>
-              <w:t>kornegay.com</w:t>
+              <w:t>k</w:t>
+            </w:r>
+            <w:r>
+              <w:rPr>
+                <w:color w:val="auto"/>
+              </w:rPr>
+              <w:t>ornegay.github.io</w:t>
             </w:r>
             <w:sdt>
               <w:sdtPr>
@@ -186,7 +192,6 @@
                 <w15:appearance w15:val="hidden"/>
                 <w:text w:multiLine="1"/>
               </w:sdtPr>
-              <w:sdtEndPr/>
               <w:sdtContent>
                 <w:r>
                   <w:rPr>
@@ -1025,7 +1030,6 @@
                 <w15:appearance w15:val="hidden"/>
                 <w:text w:multiLine="1"/>
               </w:sdtPr>
-              <w:sdtEndPr/>
               <w:sdtContent>
                 <w:r>
                   <w:rPr>
@@ -1037,7 +1041,7 @@
                   <w:rPr>
                     <w:color w:val="auto"/>
                   </w:rPr>
-                  <w:t>kornegay.github.io</w:t>
+                  <w:t>.kornegay@gmail.com</w:t>
                 </w:r>
               </w:sdtContent>
             </w:sdt>
@@ -3532,7 +3536,6 @@
                 <w:showingPlcHdr/>
                 <w15:appearance w15:val="hidden"/>
               </w:sdtPr>
-              <w:sdtEndPr/>
               <w:sdtContent>
                 <w:r>
                   <w:t>Education</w:t>
@@ -3572,7 +3575,7 @@
         <w:rPr>
           <w:rStyle w:val="Emphasis"/>
         </w:rPr>
-        <w:t>8/2021 – 5/2025</w:t>
+        <w:t>Graduated 5/2025</w:t>
       </w:r>
     </w:p>
     <w:p>
@@ -3593,13 +3596,28 @@
         <w:t>GPA</w:t>
       </w:r>
       <w:r>
-        <w:t>, UTK eSports club (co-captain)</w:t>
+        <w:t>,</w:t>
+      </w:r>
+      <w:r>
+        <w:t xml:space="preserve"> Summa Cum Laude,</w:t>
+      </w:r>
+      <w:r>
+        <w:t xml:space="preserve"> UTK eSports club (co-captain)</w:t>
+      </w:r>
+      <w:r>
+        <w:t>,</w:t>
       </w:r>
       <w:r>
         <w:t xml:space="preserve"> and </w:t>
       </w:r>
       <w:r>
-        <w:t>Lunabotics (controls)</w:t>
+        <w:t>Lunabotics (controls</w:t>
+      </w:r>
+      <w:r>
+        <w:t xml:space="preserve"> team member</w:t>
+      </w:r>
+      <w:r>
+        <w:t>)</w:t>
       </w:r>
     </w:p>
     <w:p>
@@ -5110,7 +5128,6 @@
                 <w:showingPlcHdr/>
                 <w15:appearance w15:val="hidden"/>
               </w:sdtPr>
-              <w:sdtEndPr/>
               <w:sdtContent>
                 <w:r>
                   <w:t>Experience</w:t>
@@ -5291,7 +5308,18 @@
           <w:sz w:val="22"/>
           <w:szCs w:val="22"/>
         </w:rPr>
-        <w:t>CUDA/C++ research project to help scale data inflow to match processing speeds</w:t>
+        <w:t xml:space="preserve">CUDA/C++ research project to help scale </w:t>
+      </w:r>
+      <w:r>
+        <w:rPr>
+          <w:rStyle w:val="Emphasis"/>
+          <w:rFonts w:asciiTheme="minorHAnsi" w:hAnsiTheme="minorHAnsi" w:cstheme="minorHAnsi"/>
+          <w:b w:val="0"/>
+          <w:bCs/>
+          <w:sz w:val="22"/>
+          <w:szCs w:val="22"/>
+        </w:rPr>
+        <w:t>processing speeds with data inflow</w:t>
       </w:r>
     </w:p>
     <w:p>
@@ -5483,7 +5511,29 @@
           <w:sz w:val="22"/>
           <w:szCs w:val="22"/>
         </w:rPr>
-        <w:t>liaison between students and professor, proctoring exams, grading, and labs</w:t>
+        <w:t xml:space="preserve">liaison between students and </w:t>
+      </w:r>
+      <w:r>
+        <w:rPr>
+          <w:rStyle w:val="Emphasis"/>
+          <w:rFonts w:asciiTheme="minorHAnsi" w:hAnsiTheme="minorHAnsi" w:cstheme="minorHAnsi"/>
+          <w:b w:val="0"/>
+          <w:bCs/>
+          <w:sz w:val="22"/>
+          <w:szCs w:val="22"/>
+        </w:rPr>
+        <w:t>professors</w:t>
+      </w:r>
+      <w:r>
+        <w:rPr>
+          <w:rStyle w:val="Emphasis"/>
+          <w:rFonts w:asciiTheme="minorHAnsi" w:hAnsiTheme="minorHAnsi" w:cstheme="minorHAnsi"/>
+          <w:b w:val="0"/>
+          <w:bCs/>
+          <w:sz w:val="22"/>
+          <w:szCs w:val="22"/>
+        </w:rPr>
+        <w:t>, proctoring exams, grading, and labs</w:t>
       </w:r>
     </w:p>
     <w:p>
@@ -5563,17 +5613,6 @@
           <w:szCs w:val="22"/>
         </w:rPr>
         <w:t>)</w:t>
-      </w:r>
-      <w:r>
-        <w:rPr>
-          <w:rStyle w:val="Emphasis"/>
-          <w:rFonts w:asciiTheme="minorHAnsi" w:hAnsiTheme="minorHAnsi" w:cstheme="minorHAnsi"/>
-          <w:b w:val="0"/>
-          <w:bCs/>
-          <w:sz w:val="22"/>
-          <w:szCs w:val="22"/>
-        </w:rPr>
-        <w:t>.</w:t>
       </w:r>
     </w:p>
     <w:tbl>
@@ -8537,13 +8576,10 @@
               <w:spacing w:after="80"/>
             </w:pPr>
             <w:r>
-              <w:t>Embedde</w:t>
+              <w:t>C/C++</w:t>
             </w:r>
             <w:r>
-              <w:t>d</w:t>
-            </w:r>
-            <w:r>
-              <w:t xml:space="preserve"> C/C++</w:t>
+              <w:t xml:space="preserve"> and C#</w:t>
             </w:r>
           </w:p>
           <w:p>
@@ -8573,19 +8609,7 @@
               <w:spacing w:after="80"/>
             </w:pPr>
             <w:r>
-              <w:t xml:space="preserve">Solidity </w:t>
-            </w:r>
-            <w:r>
-              <w:t>s</w:t>
-            </w:r>
-            <w:r>
-              <w:t xml:space="preserve">mart </w:t>
-            </w:r>
-            <w:r>
-              <w:t>c</w:t>
-            </w:r>
-            <w:r>
-              <w:t>ontracts</w:t>
+              <w:t>AWS</w:t>
             </w:r>
           </w:p>
           <w:p>
@@ -8614,7 +8638,10 @@
               <w:t>Java</w:t>
             </w:r>
             <w:r>
-              <w:t>/Kotlin</w:t>
+              <w:t xml:space="preserve"> and </w:t>
+            </w:r>
+            <w:r>
+              <w:t>Kotlin</w:t>
             </w:r>
           </w:p>
           <w:p>
@@ -8623,10 +8650,7 @@
               <w:spacing w:after="80"/>
             </w:pPr>
             <w:r>
-              <w:t>JavaScript</w:t>
-            </w:r>
-            <w:r>
-              <w:t>/TypeScript</w:t>
+              <w:t>TypeScript</w:t>
             </w:r>
             <w:r>
               <w:t xml:space="preserve">, </w:t>
@@ -8635,7 +8659,7 @@
               <w:t>CSS</w:t>
             </w:r>
             <w:r>
-              <w:t>, React.JS</w:t>
+              <w:t>, React</w:t>
             </w:r>
           </w:p>
           <w:p>
@@ -8659,10 +8683,9 @@
           <w:p>
             <w:pPr>
               <w:pStyle w:val="ListBullet"/>
-              <w:spacing w:after="80"/>
             </w:pPr>
             <w:r>
-              <w:t>C#</w:t>
+              <w:t>Rust</w:t>
             </w:r>
           </w:p>
         </w:tc>
@@ -10312,7 +10335,7 @@
         </w:rPr>
       </w:pPr>
       <w:r>
-        <w:t>Personal Website</w:t>
+        <w:t>OpenTicket (Group Project)</w:t>
       </w:r>
       <w:r>
         <w:t xml:space="preserve"> | </w:t>
@@ -10321,7 +10344,144 @@
         <w:rPr>
           <w:rStyle w:val="Emphasis"/>
         </w:rPr>
-        <w:t>10/2023</w:t>
+        <w:t>5</w:t>
+      </w:r>
+      <w:r>
+        <w:rPr>
+          <w:rStyle w:val="Emphasis"/>
+        </w:rPr>
+        <w:t>/202</w:t>
+      </w:r>
+      <w:r>
+        <w:rPr>
+          <w:rStyle w:val="Emphasis"/>
+        </w:rPr>
+        <w:t>5</w:t>
+      </w:r>
+      <w:r>
+        <w:rPr>
+          <w:rStyle w:val="Emphasis"/>
+        </w:rPr>
+        <w:t xml:space="preserve"> </w:t>
+      </w:r>
+      <w:r>
+        <w:t>|</w:t>
+      </w:r>
+      <w:r>
+        <w:rPr>
+          <w:rStyle w:val="Emphasis"/>
+        </w:rPr>
+        <w:t xml:space="preserve"> Golang, React </w:t>
+      </w:r>
+      <w:r>
+        <w:rPr>
+          <w:rStyle w:val="Emphasis"/>
+        </w:rPr>
+        <w:t>T</w:t>
+      </w:r>
+      <w:r>
+        <w:rPr>
+          <w:rStyle w:val="Emphasis"/>
+        </w:rPr>
+        <w:t>ypescript), SQL, AWS CDK, Solidity</w:t>
+      </w:r>
+    </w:p>
+    <w:p>
+      <w:pPr>
+        <w:pStyle w:val="ListBullet"/>
+        <w:rPr>
+          <w:rStyle w:val="Emphasis"/>
+        </w:rPr>
+      </w:pPr>
+      <w:r>
+        <w:rPr>
+          <w:rStyle w:val="Emphasis"/>
+          <w:sz w:val="22"/>
+        </w:rPr>
+        <w:t>Go backend that interfaces with Postgres Amazon RDS on a VPC using Lambda functions</w:t>
+      </w:r>
+    </w:p>
+    <w:p>
+      <w:pPr>
+        <w:pStyle w:val="ListBullet"/>
+        <w:rPr>
+          <w:rStyle w:val="Emphasis"/>
+        </w:rPr>
+      </w:pPr>
+      <w:r>
+        <w:rPr>
+          <w:rStyle w:val="Emphasis"/>
+          <w:sz w:val="22"/>
+        </w:rPr>
+        <w:t xml:space="preserve">Solidity contract to </w:t>
+      </w:r>
+      <w:r>
+        <w:rPr>
+          <w:rStyle w:val="Emphasis"/>
+          <w:sz w:val="22"/>
+        </w:rPr>
+        <w:t>handle</w:t>
+      </w:r>
+      <w:r>
+        <w:rPr>
+          <w:rStyle w:val="Emphasis"/>
+          <w:sz w:val="22"/>
+        </w:rPr>
+        <w:t xml:space="preserve"> ticketing and tracking</w:t>
+      </w:r>
+    </w:p>
+    <w:p>
+      <w:pPr>
+        <w:pStyle w:val="ListBullet"/>
+        <w:rPr>
+          <w:iCs/>
+          <w:sz w:val="26"/>
+        </w:rPr>
+      </w:pPr>
+      <w:r>
+        <w:rPr>
+          <w:rStyle w:val="Emphasis"/>
+          <w:sz w:val="22"/>
+        </w:rPr>
+        <w:t>React frontend using typescript with dynamic.xyz authentication provider and Coinbase API helpers for conversion</w:t>
+      </w:r>
+    </w:p>
+    <w:p>
+      <w:pPr>
+        <w:pStyle w:val="Heading2"/>
+        <w:rPr>
+          <w:rStyle w:val="Emphasis"/>
+        </w:rPr>
+      </w:pPr>
+      <w:r>
+        <w:t>Rdiff</w:t>
+      </w:r>
+      <w:r>
+        <w:t xml:space="preserve"> </w:t>
+      </w:r>
+      <w:r>
+        <w:t xml:space="preserve">(Personal Project) </w:t>
+      </w:r>
+      <w:r>
+        <w:t xml:space="preserve">| </w:t>
+      </w:r>
+      <w:r>
+        <w:rPr>
+          <w:rStyle w:val="Emphasis"/>
+        </w:rPr>
+        <w:t>4</w:t>
+      </w:r>
+      <w:r>
+        <w:rPr>
+          <w:rStyle w:val="Emphasis"/>
+        </w:rPr>
+        <w:t>/202</w:t>
+      </w:r>
+      <w:r>
+        <w:rPr>
+          <w:rStyle w:val="Emphasis"/>
+        </w:rPr>
+        <w:t>5</w:t>
       </w:r>
       <w:r>
         <w:rPr>
@@ -10342,13 +10502,7 @@
         <w:rPr>
           <w:rStyle w:val="Emphasis"/>
         </w:rPr>
-        <w:t>TypeScript</w:t>
-      </w:r>
-      <w:r>
-        <w:rPr>
-          <w:rStyle w:val="Emphasis"/>
-        </w:rPr>
-        <w:t xml:space="preserve"> (Next.JS)</w:t>
+        <w:t>Rust</w:t>
       </w:r>
     </w:p>
     <w:p>
@@ -10363,7 +10517,14 @@
           <w:rStyle w:val="Emphasis"/>
           <w:sz w:val="22"/>
         </w:rPr>
-        <w:t>calebkornegay.com</w:t>
+        <w:t xml:space="preserve">Rust </w:t>
+      </w:r>
+      <w:r>
+        <w:rPr>
+          <w:rStyle w:val="Emphasis"/>
+          <w:sz w:val="22"/>
+        </w:rPr>
+        <w:t>terminal user interface to show the differences between two files with syntax highlighting</w:t>
       </w:r>
     </w:p>
     <w:p>
@@ -10374,7 +10535,10 @@
         </w:rPr>
       </w:pPr>
       <w:r>
-        <w:t xml:space="preserve">Personal Project | </w:t>
+        <w:t xml:space="preserve">Digital Dash (Personal Project) </w:t>
+      </w:r>
+      <w:r>
+        <w:t xml:space="preserve">| </w:t>
       </w:r>
       <w:r>
         <w:rPr>
@@ -10416,78 +10580,43 @@
           <w:rStyle w:val="Emphasis"/>
           <w:sz w:val="22"/>
         </w:rPr>
-        <w:t>Go backend that runs on a raspberry pi and serves up car sensor data across Bluetooth from the OBD-II port</w:t>
+        <w:t xml:space="preserve">Go backend that runs on a </w:t>
       </w:r>
       <w:r>
         <w:rPr>
           <w:rStyle w:val="Emphasis"/>
           <w:sz w:val="22"/>
         </w:rPr>
-        <w:t>. Android native app to receive and show data written in Kotlin, plan on making it into an Android Auto app to see in my car</w:t>
+        <w:t>R</w:t>
       </w:r>
       <w:r>
         <w:rPr>
           <w:rStyle w:val="Emphasis"/>
           <w:sz w:val="22"/>
         </w:rPr>
-        <w:t>’s IVI</w:t>
-      </w:r>
-    </w:p>
-    <w:p>
-      <w:pPr>
-        <w:pStyle w:val="Heading2"/>
-        <w:rPr>
-          <w:rStyle w:val="Emphasis"/>
-        </w:rPr>
-      </w:pPr>
-      <w:r>
-        <w:t xml:space="preserve">Group Project | </w:t>
+        <w:t xml:space="preserve">aspberry </w:t>
       </w:r>
       <w:r>
         <w:rPr>
           <w:rStyle w:val="Emphasis"/>
+          <w:sz w:val="22"/>
         </w:rPr>
-        <w:t xml:space="preserve">12/2024 </w:t>
-      </w:r>
-      <w:r>
-        <w:t>|</w:t>
+        <w:t>P</w:t>
       </w:r>
       <w:r>
         <w:rPr>
           <w:rStyle w:val="Emphasis"/>
+          <w:sz w:val="22"/>
         </w:rPr>
-        <w:t xml:space="preserve"> Go</w:t>
-      </w:r>
-      <w:r>
-        <w:rPr>
-          <w:rStyle w:val="Emphasis"/>
-        </w:rPr>
-        <w:t>lang</w:t>
-      </w:r>
-      <w:r>
-        <w:rPr>
-          <w:rStyle w:val="Emphasis"/>
-        </w:rPr>
-        <w:t xml:space="preserve">, React (typescript), </w:t>
-      </w:r>
-      <w:r>
-        <w:rPr>
-          <w:rStyle w:val="Emphasis"/>
-        </w:rPr>
-        <w:t>SQL, AWS CDK</w:t>
-      </w:r>
-      <w:r>
-        <w:rPr>
-          <w:rStyle w:val="Emphasis"/>
-        </w:rPr>
-        <w:t>, Solidity</w:t>
+        <w:t>i and serves up car sensor data across Bluetooth from the OBD-II port</w:t>
       </w:r>
     </w:p>
     <w:p>
       <w:pPr>
         <w:pStyle w:val="ListBullet"/>
         <w:rPr>
-          <w:rStyle w:val="Emphasis"/>
+          <w:iCs/>
+          <w:sz w:val="26"/>
         </w:rPr>
       </w:pPr>
       <w:r>
@@ -10495,101 +10624,8 @@
           <w:rStyle w:val="Emphasis"/>
           <w:sz w:val="22"/>
         </w:rPr>
-        <w:t>Currently hosted at vendor.dev.opentix.co and client.dev.opentix.co</w:t>
+        <w:t>Android native app to receive and show data written in Kotlin</w:t>
       </w:r>
-    </w:p>
-    <w:p>
-      <w:pPr>
-        <w:pStyle w:val="ListBullet"/>
-        <w:rPr>
-          <w:rStyle w:val="Emphasis"/>
-        </w:rPr>
-      </w:pPr>
-      <w:r>
-        <w:rPr>
-          <w:rStyle w:val="Emphasis"/>
-          <w:sz w:val="22"/>
-        </w:rPr>
-        <w:t xml:space="preserve">Go backend that </w:t>
-      </w:r>
-      <w:r>
-        <w:rPr>
-          <w:rStyle w:val="Emphasis"/>
-          <w:sz w:val="22"/>
-        </w:rPr>
-        <w:t>interfaces with Postgres Amazon RDS on a VPC using Lambda functions</w:t>
-      </w:r>
-    </w:p>
-    <w:p>
-      <w:pPr>
-        <w:pStyle w:val="ListBullet"/>
-        <w:rPr>
-          <w:rStyle w:val="Emphasis"/>
-        </w:rPr>
-      </w:pPr>
-      <w:r>
-        <w:rPr>
-          <w:rStyle w:val="Emphasis"/>
-          <w:sz w:val="22"/>
-        </w:rPr>
-        <w:t>Solidity contract</w:t>
-      </w:r>
-      <w:r>
-        <w:rPr>
-          <w:rStyle w:val="Emphasis"/>
-          <w:sz w:val="22"/>
-        </w:rPr>
-        <w:t xml:space="preserve"> to deal with ticketing</w:t>
-      </w:r>
-      <w:r>
-        <w:rPr>
-          <w:rStyle w:val="Emphasis"/>
-          <w:sz w:val="22"/>
-        </w:rPr>
-        <w:t xml:space="preserve"> and tracking portion, deployed at </w:t>
-      </w:r>
-      <w:r>
-        <w:rPr>
-          <w:rStyle w:val="Emphasis"/>
-          <w:sz w:val="22"/>
-        </w:rPr>
-        <w:t>oklink.com/amoy/address/0x578d05ef4BDC8Ee7f0d23b3130BE5F130f88ab29</w:t>
-      </w:r>
-    </w:p>
-    <w:p>
-      <w:pPr>
-        <w:pStyle w:val="ListBullet"/>
-        <w:rPr>
-          <w:rStyle w:val="Emphasis"/>
-        </w:rPr>
-      </w:pPr>
-      <w:r>
-        <w:rPr>
-          <w:rStyle w:val="Emphasis"/>
-          <w:sz w:val="22"/>
-        </w:rPr>
-        <w:t>React frontend using typescript</w:t>
-      </w:r>
-      <w:r>
-        <w:rPr>
-          <w:rStyle w:val="Emphasis"/>
-          <w:sz w:val="22"/>
-        </w:rPr>
-        <w:t xml:space="preserve"> with dynamic.xyz authentication provider and Coinbase API helpers for conversion</w:t>
-      </w:r>
-    </w:p>
-    <w:p>
-      <w:pPr>
-        <w:pStyle w:val="ListBullet"/>
-        <w:numPr>
-          <w:ilvl w:val="0"/>
-          <w:numId w:val="0"/>
-        </w:numPr>
-        <w:rPr>
-          <w:iCs/>
-          <w:sz w:val="26"/>
-        </w:rPr>
-      </w:pPr>
     </w:p>
     <w:sectPr>
       <w:footerReference w:type="default" r:id="rId14"/>
@@ -13176,11 +13212,13 @@
     <w:rsid w:val="002C0634"/>
     <w:rsid w:val="003A2C41"/>
     <w:rsid w:val="003B3F8C"/>
+    <w:rsid w:val="00506B1A"/>
     <w:rsid w:val="00536B25"/>
     <w:rsid w:val="00590A35"/>
     <w:rsid w:val="00615095"/>
     <w:rsid w:val="006B4644"/>
     <w:rsid w:val="006E7DD5"/>
+    <w:rsid w:val="007771EB"/>
     <w:rsid w:val="008307D0"/>
     <w:rsid w:val="009971AA"/>
     <w:rsid w:val="00A81315"/>
@@ -13189,7 +13227,9 @@
     <w:rsid w:val="00B94EEB"/>
     <w:rsid w:val="00BF5991"/>
     <w:rsid w:val="00C137EA"/>
+    <w:rsid w:val="00C5021E"/>
     <w:rsid w:val="00C71097"/>
+    <w:rsid w:val="00C85CFB"/>
     <w:rsid w:val="00DC299F"/>
     <w:rsid w:val="00E24089"/>
     <w:rsid w:val="00EE009B"/>
@@ -13924,7 +13964,7 @@
   <CompanyPhone>
 (615) 924-4117  </CompanyPhone>
   <CompanyFax/>
-  <CompanyEmail>calebkornegay.github.io</CompanyEmail>
+  <CompanyEmail>caleb.kornegay@gmail.com</CompanyEmail>
 </CoverPageProperties>
 </file>
 

</xml_diff>